<commit_message>
Mise à jour des instructions à lire
</commit_message>
<xml_diff>
--- a/DOCKER/Instructions Docker à lire.docx
+++ b/DOCKER/Instructions Docker à lire.docx
@@ -69,33 +69,8 @@
           <w:b/>
           <w:bCs/>
         </w:rPr>
-        <w:t xml:space="preserve"> dans les fichiers de </w:t>
-      </w:r>
-      <w:proofErr w:type="spellStart"/>
-      <w:r>
-        <w:rPr>
-          <w:b/>
-          <w:bCs/>
-        </w:rPr>
-        <w:t>config.php</w:t>
-      </w:r>
-      <w:proofErr w:type="spellEnd"/>
-      <w:r>
-        <w:rPr>
-          <w:b/>
-          <w:bCs/>
-        </w:rPr>
-        <w:t xml:space="preserve"> liés à la </w:t>
-      </w:r>
-      <w:proofErr w:type="spellStart"/>
-      <w:r>
-        <w:rPr>
-          <w:b/>
-          <w:bCs/>
-        </w:rPr>
-        <w:t>Database</w:t>
-      </w:r>
-      <w:proofErr w:type="spellEnd"/>
+        <w:t xml:space="preserve"> dans les fichiers de config.php liés à la Database</w:t>
+      </w:r>
     </w:p>
     <w:p>
       <w:pPr>
@@ -147,21 +122,7 @@
         <w:rPr>
           <w:u w:val="single"/>
         </w:rPr>
-        <w:t xml:space="preserve"> dans le prompt/</w:t>
-      </w:r>
-      <w:proofErr w:type="spellStart"/>
-      <w:r>
-        <w:rPr>
-          <w:u w:val="single"/>
-        </w:rPr>
-        <w:t>shell</w:t>
-      </w:r>
-      <w:proofErr w:type="spellEnd"/>
-      <w:r>
-        <w:rPr>
-          <w:u w:val="single"/>
-        </w:rPr>
-        <w:t>/terminal de votre machine)</w:t>
+        <w:t xml:space="preserve"> dans le prompt/shell/terminal de votre machine)</w:t>
       </w:r>
       <w:r>
         <w:rPr>
@@ -172,13 +133,8 @@
     </w:p>
     <w:p>
       <w:r>
-        <w:t xml:space="preserve">Constante concernée dans chaque fichier </w:t>
-      </w:r>
-      <w:proofErr w:type="spellStart"/>
-      <w:r>
-        <w:t>config.php</w:t>
-      </w:r>
-      <w:proofErr w:type="spellEnd"/>
+        <w:t>Constante concernée dans chaque fichier config.php</w:t>
+      </w:r>
       <w:r>
         <w:t> :</w:t>
       </w:r>
@@ -193,23 +149,13 @@
       <w:r>
         <w:t xml:space="preserve">  </w:t>
       </w:r>
-      <w:proofErr w:type="spellStart"/>
-      <w:r>
-        <w:rPr>
-          <w:b/>
-          <w:bCs/>
-        </w:rPr>
-        <w:t>define</w:t>
-      </w:r>
-      <w:proofErr w:type="spellEnd"/>
-      <w:r>
-        <w:rPr>
-          <w:b/>
-          <w:bCs/>
-        </w:rPr>
-        <w:t>('DB_HOST','</w:t>
-      </w:r>
-      <w:proofErr w:type="spellStart"/>
+      <w:r>
+        <w:rPr>
+          <w:b/>
+          <w:bCs/>
+        </w:rPr>
+        <w:t>define('DB_HOST','</w:t>
+      </w:r>
       <w:r>
         <w:rPr>
           <w:b/>
@@ -218,7 +164,6 @@
         </w:rPr>
         <w:t>VotreAdresseIPMachine</w:t>
       </w:r>
-      <w:proofErr w:type="spellEnd"/>
       <w:r>
         <w:rPr>
           <w:b/>
@@ -277,16 +222,8 @@
         <w:rPr>
           <w:lang w:val="en-ID"/>
         </w:rPr>
-        <w:t>1_allUsers\DB\</w:t>
-      </w:r>
-      <w:proofErr w:type="spellStart"/>
-      <w:r>
-        <w:rPr>
-          <w:lang w:val="en-ID"/>
-        </w:rPr>
-        <w:t>config.php</w:t>
-      </w:r>
-      <w:proofErr w:type="spellEnd"/>
+        <w:t>1_allUsers\DB\config.php</w:t>
+      </w:r>
     </w:p>
     <w:p>
       <w:pPr>
@@ -327,16 +264,8 @@
         <w:rPr>
           <w:lang w:val="en-ID"/>
         </w:rPr>
-        <w:t>1_allUsers\Functions\DB\</w:t>
-      </w:r>
-      <w:proofErr w:type="spellStart"/>
-      <w:r>
-        <w:rPr>
-          <w:lang w:val="en-ID"/>
-        </w:rPr>
-        <w:t>config.php</w:t>
-      </w:r>
-      <w:proofErr w:type="spellEnd"/>
+        <w:t>1_allUsers\Functions\DB\config.php</w:t>
+      </w:r>
     </w:p>
     <w:p>
       <w:pPr>
@@ -377,30 +306,8 @@
         <w:rPr>
           <w:lang w:val="en-ID"/>
         </w:rPr>
-        <w:t>2_vgTeam\</w:t>
-      </w:r>
-      <w:proofErr w:type="spellStart"/>
-      <w:r>
-        <w:rPr>
-          <w:lang w:val="en-ID"/>
-        </w:rPr>
-        <w:t>gestionLibelles</w:t>
-      </w:r>
-      <w:proofErr w:type="spellEnd"/>
-      <w:r>
-        <w:rPr>
-          <w:lang w:val="en-ID"/>
-        </w:rPr>
-        <w:t>\DB\</w:t>
-      </w:r>
-      <w:proofErr w:type="spellStart"/>
-      <w:r>
-        <w:rPr>
-          <w:lang w:val="en-ID"/>
-        </w:rPr>
-        <w:t>config.php</w:t>
-      </w:r>
-      <w:proofErr w:type="spellEnd"/>
+        <w:t>2_vgTeam\gestionLibelles\DB\config.php</w:t>
+      </w:r>
     </w:p>
     <w:p>
       <w:pPr>
@@ -441,30 +348,8 @@
         <w:rPr>
           <w:lang w:val="en-ID"/>
         </w:rPr>
-        <w:t>2_vgTeam\</w:t>
-      </w:r>
-      <w:proofErr w:type="spellStart"/>
-      <w:r>
-        <w:rPr>
-          <w:lang w:val="en-ID"/>
-        </w:rPr>
-        <w:t>gestionMenus</w:t>
-      </w:r>
-      <w:proofErr w:type="spellEnd"/>
-      <w:r>
-        <w:rPr>
-          <w:lang w:val="en-ID"/>
-        </w:rPr>
-        <w:t>\DB\</w:t>
-      </w:r>
-      <w:proofErr w:type="spellStart"/>
-      <w:r>
-        <w:rPr>
-          <w:lang w:val="en-ID"/>
-        </w:rPr>
-        <w:t>config.php</w:t>
-      </w:r>
-      <w:proofErr w:type="spellEnd"/>
+        <w:t>2_vgTeam\gestionMenus\DB\config.php</w:t>
+      </w:r>
     </w:p>
     <w:p>
       <w:pPr>
@@ -487,30 +372,8 @@
         <w:rPr>
           <w:lang w:val="en-ID"/>
         </w:rPr>
-        <w:t>DOCKER\site\2_vgTeam\</w:t>
-      </w:r>
-      <w:proofErr w:type="spellStart"/>
-      <w:r>
-        <w:rPr>
-          <w:lang w:val="en-ID"/>
-        </w:rPr>
-        <w:t>gestionMenus</w:t>
-      </w:r>
-      <w:proofErr w:type="spellEnd"/>
-      <w:r>
-        <w:rPr>
-          <w:lang w:val="en-ID"/>
-        </w:rPr>
-        <w:t>\Functions\DB\</w:t>
-      </w:r>
-      <w:proofErr w:type="spellStart"/>
-      <w:r>
-        <w:rPr>
-          <w:lang w:val="en-ID"/>
-        </w:rPr>
-        <w:t>config.php</w:t>
-      </w:r>
-      <w:proofErr w:type="spellEnd"/>
+        <w:t>DOCKER\site\2_vgTeam\gestionMenus\Functions\DB\config.php</w:t>
+      </w:r>
     </w:p>
     <w:p>
       <w:pPr>
@@ -551,30 +414,8 @@
         <w:rPr>
           <w:lang w:val="en-ID"/>
         </w:rPr>
-        <w:t>2_vgTeam\</w:t>
-      </w:r>
-      <w:proofErr w:type="spellStart"/>
-      <w:r>
-        <w:rPr>
-          <w:lang w:val="en-ID"/>
-        </w:rPr>
-        <w:t>gestionPlats</w:t>
-      </w:r>
-      <w:proofErr w:type="spellEnd"/>
-      <w:r>
-        <w:rPr>
-          <w:lang w:val="en-ID"/>
-        </w:rPr>
-        <w:t>\DB\</w:t>
-      </w:r>
-      <w:proofErr w:type="spellStart"/>
-      <w:r>
-        <w:rPr>
-          <w:lang w:val="en-ID"/>
-        </w:rPr>
-        <w:t>config.php</w:t>
-      </w:r>
-      <w:proofErr w:type="spellEnd"/>
+        <w:t>2_vgTeam\gestionPlats\DB\config.php</w:t>
+      </w:r>
     </w:p>
     <w:p>
       <w:pPr>
@@ -615,30 +456,8 @@
         <w:rPr>
           <w:lang w:val="en-ID"/>
         </w:rPr>
-        <w:t>2_vgTeam\</w:t>
-      </w:r>
-      <w:proofErr w:type="spellStart"/>
-      <w:r>
-        <w:rPr>
-          <w:lang w:val="en-ID"/>
-        </w:rPr>
-        <w:t>menuPlatsAsso</w:t>
-      </w:r>
-      <w:proofErr w:type="spellEnd"/>
-      <w:r>
-        <w:rPr>
-          <w:lang w:val="en-ID"/>
-        </w:rPr>
-        <w:t>\DB\</w:t>
-      </w:r>
-      <w:proofErr w:type="spellStart"/>
-      <w:r>
-        <w:rPr>
-          <w:lang w:val="en-ID"/>
-        </w:rPr>
-        <w:t>config.php</w:t>
-      </w:r>
-      <w:proofErr w:type="spellEnd"/>
+        <w:t>2_vgTeam\menuPlatsAsso\DB\config.php</w:t>
+      </w:r>
     </w:p>
     <w:p>
       <w:pPr>
@@ -679,44 +498,8 @@
         <w:rPr>
           <w:lang w:val="en-ID"/>
         </w:rPr>
-        <w:t>2_vgTeam\</w:t>
-      </w:r>
-      <w:proofErr w:type="spellStart"/>
-      <w:r>
-        <w:rPr>
-          <w:lang w:val="en-ID"/>
-        </w:rPr>
-        <w:t>menuPlatsAsso</w:t>
-      </w:r>
-      <w:proofErr w:type="spellEnd"/>
-      <w:r>
-        <w:rPr>
-          <w:lang w:val="en-ID"/>
-        </w:rPr>
-        <w:t>\</w:t>
-      </w:r>
-      <w:proofErr w:type="spellStart"/>
-      <w:r>
-        <w:rPr>
-          <w:lang w:val="en-ID"/>
-        </w:rPr>
-        <w:t>menuPlatsMVC</w:t>
-      </w:r>
-      <w:proofErr w:type="spellEnd"/>
-      <w:r>
-        <w:rPr>
-          <w:lang w:val="en-ID"/>
-        </w:rPr>
-        <w:t>\DB\</w:t>
-      </w:r>
-      <w:proofErr w:type="spellStart"/>
-      <w:r>
-        <w:rPr>
-          <w:lang w:val="en-ID"/>
-        </w:rPr>
-        <w:t>config.php</w:t>
-      </w:r>
-      <w:proofErr w:type="spellEnd"/>
+        <w:t>2_vgTeam\menuPlatsAsso\menuPlatsMVC\DB\config.php</w:t>
+      </w:r>
     </w:p>
     <w:p>
       <w:pPr>
@@ -757,30 +540,8 @@
         <w:rPr>
           <w:lang w:val="en-ID"/>
         </w:rPr>
-        <w:t>3_admin\</w:t>
-      </w:r>
-      <w:proofErr w:type="spellStart"/>
-      <w:r>
-        <w:rPr>
-          <w:lang w:val="en-ID"/>
-        </w:rPr>
-        <w:t>gestionTeam</w:t>
-      </w:r>
-      <w:proofErr w:type="spellEnd"/>
-      <w:r>
-        <w:rPr>
-          <w:lang w:val="en-ID"/>
-        </w:rPr>
-        <w:t>\DB\</w:t>
-      </w:r>
-      <w:proofErr w:type="spellStart"/>
-      <w:r>
-        <w:rPr>
-          <w:lang w:val="en-ID"/>
-        </w:rPr>
-        <w:t>config.php</w:t>
-      </w:r>
-      <w:proofErr w:type="spellEnd"/>
+        <w:t>3_admin\gestionTeam\DB\config.php</w:t>
+      </w:r>
     </w:p>
     <w:p>
       <w:pPr>
@@ -799,7 +560,13 @@
         <w:t>nt</w:t>
       </w:r>
       <w:r>
-        <w:t xml:space="preserve"> dans le dossier actuels sont renseignés avec l’adresse IPV4 (carte wifi) de ma machine</w:t>
+        <w:t xml:space="preserve"> dans le dossier actuel sont renseigné</w:t>
+      </w:r>
+      <w:r>
+        <w:t>e</w:t>
+      </w:r>
+      <w:r>
+        <w:t>s avec l’adresse IPV4 (carte wifi) de ma machine</w:t>
       </w:r>
       <w:r>
         <w:t xml:space="preserve"> comme spécifiés dans les illustrations </w:t>
@@ -925,15 +692,7 @@
         <w:t>O</w:t>
       </w:r>
       <w:r>
-        <w:t>uvrir le terminal/</w:t>
-      </w:r>
-      <w:proofErr w:type="spellStart"/>
-      <w:r>
-        <w:t>shell</w:t>
-      </w:r>
-      <w:proofErr w:type="spellEnd"/>
-      <w:r>
-        <w:t xml:space="preserve"> e</w:t>
+        <w:t>uvrir le terminal/shell e</w:t>
       </w:r>
       <w:r>
         <w:t>n étant sur le dossier « docker »</w:t>
@@ -952,58 +711,16 @@
           <w:b/>
           <w:bCs/>
         </w:rPr>
-        <w:t xml:space="preserve">Eteindre tout application (type </w:t>
-      </w:r>
-      <w:proofErr w:type="spellStart"/>
-      <w:r>
-        <w:rPr>
-          <w:b/>
-          <w:bCs/>
-        </w:rPr>
-        <w:t>xampp</w:t>
-      </w:r>
-      <w:proofErr w:type="spellEnd"/>
-      <w:r>
-        <w:rPr>
-          <w:b/>
-          <w:bCs/>
-        </w:rPr>
-        <w:t>/</w:t>
-      </w:r>
-      <w:proofErr w:type="spellStart"/>
-      <w:r>
-        <w:rPr>
-          <w:b/>
-          <w:bCs/>
-        </w:rPr>
-        <w:t>wampp</w:t>
-      </w:r>
-      <w:proofErr w:type="spellEnd"/>
-      <w:r>
-        <w:rPr>
-          <w:b/>
-          <w:bCs/>
-        </w:rPr>
-        <w:t>)</w:t>
-      </w:r>
-      <w:r>
-        <w:t xml:space="preserve"> requérant des ports cités dans le fichiers docker (docker-</w:t>
-      </w:r>
-      <w:proofErr w:type="spellStart"/>
-      <w:r>
-        <w:t>compose.yml</w:t>
-      </w:r>
-      <w:proofErr w:type="spellEnd"/>
-      <w:r>
-        <w:t xml:space="preserve"> et </w:t>
-      </w:r>
-      <w:proofErr w:type="spellStart"/>
-      <w:r>
-        <w:t>dockerfile</w:t>
-      </w:r>
-      <w:proofErr w:type="spellEnd"/>
-      <w:r>
-        <w:t>)</w:t>
+        <w:t>Eteindre tout application (type xampp/wampp)</w:t>
+      </w:r>
+      <w:r>
+        <w:t xml:space="preserve"> requérant des ports cités dans le</w:t>
+      </w:r>
+      <w:r>
+        <w:t>s</w:t>
+      </w:r>
+      <w:r>
+        <w:t xml:space="preserve"> fichiers docker (docker-compose.yml et dockerfile)</w:t>
       </w:r>
     </w:p>
     <w:p>
@@ -1063,7 +780,21 @@
           <w:b/>
           <w:bCs/>
         </w:rPr>
-        <w:t>Constater l’ouverture des fenêtres du site et les données récupérés via la DB</w:t>
+        <w:t>Constater l’ouverture des fenêtres du site et les données récupéré</w:t>
+      </w:r>
+      <w:r>
+        <w:rPr>
+          <w:b/>
+          <w:bCs/>
+        </w:rPr>
+        <w:t>e</w:t>
+      </w:r>
+      <w:r>
+        <w:rPr>
+          <w:b/>
+          <w:bCs/>
+        </w:rPr>
+        <w:t>s via la DB</w:t>
       </w:r>
     </w:p>
     <w:p>
@@ -1140,15 +871,13 @@
         </w:rPr>
         <w:t>(</w:t>
       </w:r>
-      <w:proofErr w:type="spellStart"/>
-      <w:r>
-        <w:rPr>
-          <w:b/>
-          <w:bCs/>
-        </w:rPr>
-        <w:t>php</w:t>
-      </w:r>
-      <w:proofErr w:type="spellEnd"/>
+      <w:r>
+        <w:rPr>
+          <w:b/>
+          <w:bCs/>
+        </w:rPr>
+        <w:t>PHP</w:t>
+      </w:r>
       <w:r>
         <w:rPr>
           <w:b/>
@@ -1156,15 +885,13 @@
         </w:rPr>
         <w:t>/</w:t>
       </w:r>
-      <w:proofErr w:type="spellStart"/>
-      <w:r>
-        <w:rPr>
-          <w:b/>
-          <w:bCs/>
-        </w:rPr>
-        <w:t>mysql</w:t>
-      </w:r>
-      <w:proofErr w:type="spellEnd"/>
+      <w:r>
+        <w:rPr>
+          <w:b/>
+          <w:bCs/>
+        </w:rPr>
+        <w:t>MySQL</w:t>
+      </w:r>
       <w:r>
         <w:rPr>
           <w:b/>

</xml_diff>